<commit_message>
docs: expand integration and intelligent scenario specifications
</commit_message>
<xml_diff>
--- a/3-业务蓝图-终态/业务蓝图过程文档/SCOS业务蓝图第三部分智能化应用场景总表.docx
+++ b/3-业务蓝图-终态/业务蓝图过程文档/SCOS业务蓝图第三部分智能化应用场景总表.docx
@@ -354,7 +354,6 @@
               <w:spacing w:before="0" w:after="0" w:line="240" w:lineRule="auto"/>
               <w:jc w:val="center"/>
             </w:pPr>
-            <w:r/>
             <w:r>
               <w:rPr>
                 <w:rFonts w:ascii="宋体" w:hAnsi="宋体" w:eastAsia="宋体"/>
@@ -388,7 +387,6 @@
               <w:spacing w:before="0" w:after="0" w:line="240" w:lineRule="auto"/>
               <w:jc w:val="center"/>
             </w:pPr>
-            <w:r/>
             <w:r>
               <w:rPr>
                 <w:rFonts w:ascii="宋体" w:hAnsi="宋体" w:eastAsia="宋体"/>
@@ -422,7 +420,6 @@
               <w:spacing w:before="0" w:after="0" w:line="240" w:lineRule="auto"/>
               <w:jc w:val="center"/>
             </w:pPr>
-            <w:r/>
             <w:r>
               <w:rPr>
                 <w:rFonts w:ascii="宋体" w:hAnsi="宋体" w:eastAsia="宋体"/>
@@ -456,7 +453,6 @@
               <w:spacing w:before="0" w:after="0" w:line="240" w:lineRule="auto"/>
               <w:jc w:val="center"/>
             </w:pPr>
-            <w:r/>
             <w:r>
               <w:rPr>
                 <w:rFonts w:ascii="宋体" w:hAnsi="宋体" w:eastAsia="宋体"/>
@@ -490,7 +486,6 @@
               <w:spacing w:before="0" w:after="0" w:line="240" w:lineRule="auto"/>
               <w:jc w:val="center"/>
             </w:pPr>
-            <w:r/>
             <w:r>
               <w:rPr>
                 <w:rFonts w:ascii="宋体" w:hAnsi="宋体" w:eastAsia="宋体"/>
@@ -524,7 +519,6 @@
               <w:spacing w:before="0" w:after="0" w:line="240" w:lineRule="auto"/>
               <w:jc w:val="center"/>
             </w:pPr>
-            <w:r/>
             <w:r>
               <w:rPr>
                 <w:rFonts w:ascii="宋体" w:hAnsi="宋体" w:eastAsia="宋体"/>
@@ -558,7 +552,6 @@
               <w:spacing w:before="0" w:after="0" w:line="240" w:lineRule="auto"/>
               <w:jc w:val="center"/>
             </w:pPr>
-            <w:r/>
             <w:r>
               <w:rPr>
                 <w:rFonts w:ascii="宋体" w:hAnsi="宋体" w:eastAsia="宋体"/>
@@ -615,7 +608,6 @@
               <w:spacing w:before="0" w:after="0" w:line="240" w:lineRule="auto"/>
               <w:jc w:val="center"/>
             </w:pPr>
-            <w:r/>
             <w:r>
               <w:rPr>
                 <w:rFonts w:ascii="宋体" w:hAnsi="宋体" w:eastAsia="宋体"/>
@@ -649,7 +641,6 @@
               <w:spacing w:before="0" w:after="0" w:line="240" w:lineRule="auto"/>
               <w:jc w:val="center"/>
             </w:pPr>
-            <w:r/>
             <w:r>
               <w:rPr>
                 <w:rFonts w:ascii="宋体" w:hAnsi="宋体" w:eastAsia="宋体"/>
@@ -683,7 +674,6 @@
               <w:spacing w:before="0" w:after="0" w:line="240" w:lineRule="auto"/>
               <w:jc w:val="center"/>
             </w:pPr>
-            <w:r/>
             <w:r>
               <w:rPr>
                 <w:rFonts w:ascii="宋体" w:hAnsi="宋体" w:eastAsia="宋体"/>
@@ -717,7 +707,6 @@
               <w:spacing w:before="0" w:after="0" w:line="240" w:lineRule="auto"/>
               <w:jc w:val="center"/>
             </w:pPr>
-            <w:r/>
             <w:r>
               <w:rPr>
                 <w:rFonts w:ascii="宋体" w:hAnsi="宋体" w:eastAsia="宋体"/>
@@ -751,7 +740,6 @@
               <w:spacing w:before="0" w:after="0" w:line="240" w:lineRule="auto"/>
               <w:jc w:val="center"/>
             </w:pPr>
-            <w:r/>
             <w:r>
               <w:rPr>
                 <w:rFonts w:ascii="宋体" w:hAnsi="宋体" w:eastAsia="宋体"/>
@@ -785,7 +773,6 @@
               <w:spacing w:before="0" w:after="0" w:line="240" w:lineRule="auto"/>
               <w:jc w:val="center"/>
             </w:pPr>
-            <w:r/>
             <w:r>
               <w:rPr>
                 <w:rFonts w:ascii="宋体" w:hAnsi="宋体" w:eastAsia="宋体"/>
@@ -819,7 +806,6 @@
               <w:spacing w:before="0" w:after="0" w:line="240" w:lineRule="auto"/>
               <w:jc w:val="center"/>
             </w:pPr>
-            <w:r/>
             <w:r>
               <w:rPr>
                 <w:rFonts w:ascii="宋体" w:hAnsi="宋体" w:eastAsia="宋体"/>
@@ -876,7 +862,6 @@
               <w:spacing w:before="0" w:after="0" w:line="240" w:lineRule="auto"/>
               <w:jc w:val="center"/>
             </w:pPr>
-            <w:r/>
             <w:r>
               <w:rPr>
                 <w:rFonts w:ascii="宋体" w:hAnsi="宋体" w:eastAsia="宋体"/>
@@ -910,14 +895,13 @@
               <w:spacing w:before="0" w:after="0" w:line="240" w:lineRule="auto"/>
               <w:jc w:val="center"/>
             </w:pPr>
-            <w:r/>
             <w:r>
               <w:rPr>
                 <w:rFonts w:ascii="宋体" w:hAnsi="宋体" w:eastAsia="宋体"/>
                 <w:b w:val="0"/>
                 <w:sz w:val="20"/>
               </w:rPr>
-              <w:t>原料采购决策优化</w:t>
+              <w:t>成品库存优化与生产补货协同</w:t>
             </w:r>
           </w:p>
         </w:tc>
@@ -944,14 +928,13 @@
               <w:spacing w:before="0" w:after="0" w:line="240" w:lineRule="auto"/>
               <w:jc w:val="center"/>
             </w:pPr>
-            <w:r/>
             <w:r>
               <w:rPr>
                 <w:rFonts w:ascii="宋体" w:hAnsi="宋体" w:eastAsia="宋体"/>
                 <w:b w:val="0"/>
                 <w:sz w:val="20"/>
               </w:rPr>
-              <w:t>月度+周度+事件+人工</w:t>
+              <w:t>月度+周度+日度+事件</w:t>
             </w:r>
           </w:p>
         </w:tc>
@@ -978,14 +961,13 @@
               <w:spacing w:before="0" w:after="0" w:line="240" w:lineRule="auto"/>
               <w:jc w:val="center"/>
             </w:pPr>
-            <w:r/>
             <w:r>
               <w:rPr>
                 <w:rFonts w:ascii="宋体" w:hAnsi="宋体" w:eastAsia="宋体"/>
                 <w:b w:val="0"/>
                 <w:sz w:val="20"/>
               </w:rPr>
-              <w:t>混合整数规划（MILP）+多目标优化</w:t>
+              <w:t>（R,s,S）库存模型+滚动库存递推</w:t>
             </w:r>
           </w:p>
         </w:tc>
@@ -1012,14 +994,13 @@
               <w:spacing w:before="0" w:after="0" w:line="240" w:lineRule="auto"/>
               <w:jc w:val="center"/>
             </w:pPr>
-            <w:r/>
             <w:r>
               <w:rPr>
                 <w:rFonts w:ascii="宋体" w:hAnsi="宋体" w:eastAsia="宋体"/>
                 <w:b w:val="0"/>
                 <w:sz w:val="20"/>
               </w:rPr>
-              <w:t>原料需求、采购在途、供应商报价/能力、价格及资金成本</w:t>
+              <w:t>出货/订单、库存、生产入库、补充周期、储罐容量</w:t>
             </w:r>
           </w:p>
         </w:tc>
@@ -1046,14 +1027,13 @@
               <w:spacing w:before="0" w:after="0" w:line="240" w:lineRule="auto"/>
               <w:jc w:val="center"/>
             </w:pPr>
-            <w:r/>
             <w:r>
               <w:rPr>
                 <w:rFonts w:ascii="宋体" w:hAnsi="宋体" w:eastAsia="宋体"/>
                 <w:b w:val="0"/>
                 <w:sz w:val="20"/>
               </w:rPr>
-              <w:t>采购量、供应商组合、下单/到货建议</w:t>
+              <w:t>库存参数、补货建议、风险及入库建议</w:t>
             </w:r>
           </w:p>
         </w:tc>
@@ -1080,7 +1060,6 @@
               <w:spacing w:before="0" w:after="0" w:line="240" w:lineRule="auto"/>
               <w:jc w:val="center"/>
             </w:pPr>
-            <w:r/>
             <w:r>
               <w:rPr>
                 <w:rFonts w:ascii="宋体" w:hAnsi="宋体" w:eastAsia="宋体"/>
@@ -1137,7 +1116,6 @@
               <w:spacing w:before="0" w:after="0" w:line="240" w:lineRule="auto"/>
               <w:jc w:val="center"/>
             </w:pPr>
-            <w:r/>
             <w:r>
               <w:rPr>
                 <w:rFonts w:ascii="宋体" w:hAnsi="宋体" w:eastAsia="宋体"/>
@@ -1171,14 +1149,13 @@
               <w:spacing w:before="0" w:after="0" w:line="240" w:lineRule="auto"/>
               <w:jc w:val="center"/>
             </w:pPr>
-            <w:r/>
             <w:r>
               <w:rPr>
                 <w:rFonts w:ascii="宋体" w:hAnsi="宋体" w:eastAsia="宋体"/>
                 <w:b w:val="0"/>
                 <w:sz w:val="20"/>
               </w:rPr>
-              <w:t>成品库存优化与生产补货协同</w:t>
+              <w:t>精益生产排程与异常重排</w:t>
             </w:r>
           </w:p>
         </w:tc>
@@ -1205,14 +1182,13 @@
               <w:spacing w:before="0" w:after="0" w:line="240" w:lineRule="auto"/>
               <w:jc w:val="center"/>
             </w:pPr>
-            <w:r/>
             <w:r>
               <w:rPr>
                 <w:rFonts w:ascii="宋体" w:hAnsi="宋体" w:eastAsia="宋体"/>
                 <w:b w:val="0"/>
                 <w:sz w:val="20"/>
               </w:rPr>
-              <w:t>月度+周度+日度+事件</w:t>
+              <w:t/>
             </w:r>
           </w:p>
         </w:tc>
@@ -1239,14 +1215,13 @@
               <w:spacing w:before="0" w:after="0" w:line="240" w:lineRule="auto"/>
               <w:jc w:val="center"/>
             </w:pPr>
-            <w:r/>
             <w:r>
               <w:rPr>
                 <w:rFonts w:ascii="宋体" w:hAnsi="宋体" w:eastAsia="宋体"/>
                 <w:b w:val="0"/>
                 <w:sz w:val="20"/>
               </w:rPr>
-              <w:t>（R,s,S）库存模型+滚动库存递推</w:t>
+              <w:t/>
             </w:r>
           </w:p>
         </w:tc>
@@ -1273,14 +1248,13 @@
               <w:spacing w:before="0" w:after="0" w:line="240" w:lineRule="auto"/>
               <w:jc w:val="center"/>
             </w:pPr>
-            <w:r/>
             <w:r>
               <w:rPr>
                 <w:rFonts w:ascii="宋体" w:hAnsi="宋体" w:eastAsia="宋体"/>
                 <w:b w:val="0"/>
                 <w:sz w:val="20"/>
               </w:rPr>
-              <w:t>出货/订单、库存、生产入库、补充周期、储罐容量</w:t>
+              <w:t/>
             </w:r>
           </w:p>
         </w:tc>
@@ -1307,14 +1281,13 @@
               <w:spacing w:before="0" w:after="0" w:line="240" w:lineRule="auto"/>
               <w:jc w:val="center"/>
             </w:pPr>
-            <w:r/>
             <w:r>
               <w:rPr>
                 <w:rFonts w:ascii="宋体" w:hAnsi="宋体" w:eastAsia="宋体"/>
                 <w:b w:val="0"/>
                 <w:sz w:val="20"/>
               </w:rPr>
-              <w:t>库存参数、补货建议、风险及入库建议</w:t>
+              <w:t/>
             </w:r>
           </w:p>
         </w:tc>
@@ -1341,14 +1314,13 @@
               <w:spacing w:before="0" w:after="0" w:line="240" w:lineRule="auto"/>
               <w:jc w:val="center"/>
             </w:pPr>
-            <w:r/>
             <w:r>
               <w:rPr>
                 <w:rFonts w:ascii="宋体" w:hAnsi="宋体" w:eastAsia="宋体"/>
                 <w:b w:val="0"/>
                 <w:sz w:val="20"/>
               </w:rPr>
-              <w:t>是</w:t>
+              <w:t/>
             </w:r>
           </w:p>
         </w:tc>
@@ -1398,7 +1370,6 @@
               <w:spacing w:before="0" w:after="0" w:line="240" w:lineRule="auto"/>
               <w:jc w:val="center"/>
             </w:pPr>
-            <w:r/>
             <w:r>
               <w:rPr>
                 <w:rFonts w:ascii="宋体" w:hAnsi="宋体" w:eastAsia="宋体"/>
@@ -1432,14 +1403,13 @@
               <w:spacing w:before="0" w:after="0" w:line="240" w:lineRule="auto"/>
               <w:jc w:val="center"/>
             </w:pPr>
-            <w:r/>
             <w:r>
               <w:rPr>
                 <w:rFonts w:ascii="宋体" w:hAnsi="宋体" w:eastAsia="宋体"/>
                 <w:b w:val="0"/>
                 <w:sz w:val="20"/>
               </w:rPr>
-              <w:t>精益生产排程与异常重排</w:t>
+              <w:t>原料采购决策优化</w:t>
             </w:r>
           </w:p>
         </w:tc>
@@ -1466,13 +1436,13 @@
               <w:spacing w:before="0" w:after="0" w:line="240" w:lineRule="auto"/>
               <w:jc w:val="center"/>
             </w:pPr>
-            <w:r/>
             <w:r>
               <w:rPr>
                 <w:rFonts w:ascii="宋体" w:hAnsi="宋体" w:eastAsia="宋体"/>
                 <w:b w:val="0"/>
                 <w:sz w:val="20"/>
               </w:rPr>
+              <w:t>月度+周度+事件+人工</w:t>
             </w:r>
           </w:p>
         </w:tc>
@@ -1499,13 +1469,13 @@
               <w:spacing w:before="0" w:after="0" w:line="240" w:lineRule="auto"/>
               <w:jc w:val="center"/>
             </w:pPr>
-            <w:r/>
             <w:r>
               <w:rPr>
                 <w:rFonts w:ascii="宋体" w:hAnsi="宋体" w:eastAsia="宋体"/>
                 <w:b w:val="0"/>
                 <w:sz w:val="20"/>
               </w:rPr>
+              <w:t>混合整数规划（MILP）+多目标优化</w:t>
             </w:r>
           </w:p>
         </w:tc>
@@ -1532,13 +1502,13 @@
               <w:spacing w:before="0" w:after="0" w:line="240" w:lineRule="auto"/>
               <w:jc w:val="center"/>
             </w:pPr>
-            <w:r/>
             <w:r>
               <w:rPr>
                 <w:rFonts w:ascii="宋体" w:hAnsi="宋体" w:eastAsia="宋体"/>
                 <w:b w:val="0"/>
                 <w:sz w:val="20"/>
               </w:rPr>
+              <w:t>原料需求、采购在途、供应商报价/能力、价格及资金成本</w:t>
             </w:r>
           </w:p>
         </w:tc>
@@ -1565,13 +1535,13 @@
               <w:spacing w:before="0" w:after="0" w:line="240" w:lineRule="auto"/>
               <w:jc w:val="center"/>
             </w:pPr>
-            <w:r/>
             <w:r>
               <w:rPr>
                 <w:rFonts w:ascii="宋体" w:hAnsi="宋体" w:eastAsia="宋体"/>
                 <w:b w:val="0"/>
                 <w:sz w:val="20"/>
               </w:rPr>
+              <w:t>采购量、供应商组合、下单/到货建议</w:t>
             </w:r>
           </w:p>
         </w:tc>
@@ -1598,13 +1568,13 @@
               <w:spacing w:before="0" w:after="0" w:line="240" w:lineRule="auto"/>
               <w:jc w:val="center"/>
             </w:pPr>
-            <w:r/>
             <w:r>
               <w:rPr>
                 <w:rFonts w:ascii="宋体" w:hAnsi="宋体" w:eastAsia="宋体"/>
                 <w:b w:val="0"/>
                 <w:sz w:val="20"/>
               </w:rPr>
+              <w:t>是</w:t>
             </w:r>
           </w:p>
         </w:tc>
@@ -1654,7 +1624,6 @@
               <w:spacing w:before="0" w:after="0" w:line="240" w:lineRule="auto"/>
               <w:jc w:val="center"/>
             </w:pPr>
-            <w:r/>
             <w:r>
               <w:rPr>
                 <w:rFonts w:ascii="宋体" w:hAnsi="宋体" w:eastAsia="宋体"/>
@@ -1688,14 +1657,13 @@
               <w:spacing w:before="0" w:after="0" w:line="240" w:lineRule="auto"/>
               <w:jc w:val="center"/>
             </w:pPr>
-            <w:r/>
             <w:r>
               <w:rPr>
                 <w:rFonts w:ascii="宋体" w:hAnsi="宋体" w:eastAsia="宋体"/>
                 <w:b w:val="0"/>
                 <w:sz w:val="20"/>
               </w:rPr>
-              <w:t>成本统计、分摊与多维盈利分析</w:t>
+              <w:t>原辅包要货决策优化</w:t>
             </w:r>
           </w:p>
         </w:tc>
@@ -1722,14 +1690,13 @@
               <w:spacing w:before="0" w:after="0" w:line="240" w:lineRule="auto"/>
               <w:jc w:val="center"/>
             </w:pPr>
-            <w:r/>
             <w:r>
               <w:rPr>
                 <w:rFonts w:ascii="宋体" w:hAnsi="宋体" w:eastAsia="宋体"/>
                 <w:b w:val="0"/>
                 <w:sz w:val="20"/>
               </w:rPr>
-              <w:t>日/月定时+数据变更+人工</w:t>
+              <w:t>日度+事件+人工</w:t>
             </w:r>
           </w:p>
         </w:tc>
@@ -1756,14 +1723,13 @@
               <w:spacing w:before="0" w:after="0" w:line="240" w:lineRule="auto"/>
               <w:jc w:val="center"/>
             </w:pPr>
-            <w:r/>
             <w:r>
               <w:rPr>
                 <w:rFonts w:ascii="宋体" w:hAnsi="宋体" w:eastAsia="宋体"/>
                 <w:b w:val="0"/>
                 <w:sz w:val="20"/>
               </w:rPr>
-              <w:t>作业成本法（ABC）+差异分析模型</w:t>
+              <w:t>混合整数规划（MILP）+多目标优化</w:t>
             </w:r>
           </w:p>
         </w:tc>
@@ -1790,14 +1756,13 @@
               <w:spacing w:before="0" w:after="0" w:line="240" w:lineRule="auto"/>
               <w:jc w:val="center"/>
             </w:pPr>
-            <w:r/>
             <w:r>
               <w:rPr>
                 <w:rFonts w:ascii="宋体" w:hAnsi="宋体" w:eastAsia="宋体"/>
                 <w:b w:val="0"/>
                 <w:sz w:val="20"/>
               </w:rPr>
-              <w:t>SAP成本财务、MES生产能耗、WMS/TMS仓储运输、销售订单</w:t>
+              <w:t>生产耗用、库存/在途、合同余量、供应商可供、运输及质检状态</w:t>
             </w:r>
           </w:p>
         </w:tc>
@@ -1824,14 +1789,13 @@
               <w:spacing w:before="0" w:after="0" w:line="240" w:lineRule="auto"/>
               <w:jc w:val="center"/>
             </w:pPr>
-            <w:r/>
             <w:r>
               <w:rPr>
                 <w:rFonts w:ascii="宋体" w:hAnsi="宋体" w:eastAsia="宋体"/>
                 <w:b w:val="0"/>
                 <w:sz w:val="20"/>
               </w:rPr>
-              <w:t>多维成本、盈利及差异分析</w:t>
+              <w:t>供应商/合同组合、到货日期与数量、缺口预警及调整建议</w:t>
             </w:r>
           </w:p>
         </w:tc>
@@ -1858,7 +1822,6 @@
               <w:spacing w:before="0" w:after="0" w:line="240" w:lineRule="auto"/>
               <w:jc w:val="center"/>
             </w:pPr>
-            <w:r/>
             <w:r>
               <w:rPr>
                 <w:rFonts w:ascii="宋体" w:hAnsi="宋体" w:eastAsia="宋体"/>
@@ -1915,7 +1878,6 @@
               <w:spacing w:before="0" w:after="0" w:line="240" w:lineRule="auto"/>
               <w:jc w:val="center"/>
             </w:pPr>
-            <w:r/>
             <w:r>
               <w:rPr>
                 <w:rFonts w:ascii="宋体" w:hAnsi="宋体" w:eastAsia="宋体"/>
@@ -1949,13 +1911,266 @@
               <w:spacing w:before="0" w:after="0" w:line="240" w:lineRule="auto"/>
               <w:jc w:val="center"/>
             </w:pPr>
-            <w:r/>
             <w:r>
               <w:rPr>
                 <w:rFonts w:ascii="宋体" w:hAnsi="宋体" w:eastAsia="宋体"/>
                 <w:b w:val="0"/>
                 <w:sz w:val="20"/>
               </w:rPr>
+              <w:t>成本统计、分摊与多维盈利分析</w:t>
+            </w:r>
+          </w:p>
+        </w:tc>
+        <w:tc>
+          <w:tcPr>
+            <w:tcW w:w="1143" w:type="dxa"/>
+            <w:tcBorders>
+              <w:top w:val="nil"/>
+              <w:left w:val="nil"/>
+              <w:bottom w:val="nil"/>
+              <w:right w:val="nil"/>
+            </w:tcBorders>
+            <w:noWrap w:val="0"/>
+            <w:tcMar>
+              <w:top w:w="-1" w:type="dxa"/>
+              <w:left w:w="-1" w:type="dxa"/>
+              <w:bottom w:w="-1" w:type="dxa"/>
+              <w:right w:w="-1" w:type="dxa"/>
+            </w:tcMar>
+            <w:vAlign w:val="center"/>
+          </w:tcPr>
+          <w:p>
+            <w:pPr>
+              <w:spacing w:before="0" w:after="0" w:line="240" w:lineRule="auto"/>
+              <w:jc w:val="center"/>
+            </w:pPr>
+            <w:r>
+              <w:rPr>
+                <w:rFonts w:ascii="宋体" w:hAnsi="宋体" w:eastAsia="宋体"/>
+                <w:b w:val="0"/>
+                <w:sz w:val="20"/>
+              </w:rPr>
+              <w:t>日/月定时+数据变更+人工</w:t>
+            </w:r>
+          </w:p>
+        </w:tc>
+        <w:tc>
+          <w:tcPr>
+            <w:tcW w:w="1657" w:type="dxa"/>
+            <w:tcBorders>
+              <w:top w:val="nil"/>
+              <w:left w:val="nil"/>
+              <w:bottom w:val="nil"/>
+              <w:right w:val="nil"/>
+            </w:tcBorders>
+            <w:noWrap w:val="0"/>
+            <w:tcMar>
+              <w:top w:w="-1" w:type="dxa"/>
+              <w:left w:w="-1" w:type="dxa"/>
+              <w:bottom w:w="-1" w:type="dxa"/>
+              <w:right w:w="-1" w:type="dxa"/>
+            </w:tcMar>
+            <w:vAlign w:val="center"/>
+          </w:tcPr>
+          <w:p>
+            <w:pPr>
+              <w:spacing w:before="0" w:after="0" w:line="240" w:lineRule="auto"/>
+              <w:jc w:val="center"/>
+            </w:pPr>
+            <w:r>
+              <w:rPr>
+                <w:rFonts w:ascii="宋体" w:hAnsi="宋体" w:eastAsia="宋体"/>
+                <w:b w:val="0"/>
+                <w:sz w:val="20"/>
+              </w:rPr>
+              <w:t>作业成本法（ABC）+差异分析模型</w:t>
+            </w:r>
+          </w:p>
+        </w:tc>
+        <w:tc>
+          <w:tcPr>
+            <w:tcW w:w="1428" w:type="dxa"/>
+            <w:tcBorders>
+              <w:top w:val="nil"/>
+              <w:left w:val="nil"/>
+              <w:bottom w:val="nil"/>
+              <w:right w:val="nil"/>
+            </w:tcBorders>
+            <w:noWrap w:val="0"/>
+            <w:tcMar>
+              <w:top w:w="-1" w:type="dxa"/>
+              <w:left w:w="-1" w:type="dxa"/>
+              <w:bottom w:w="-1" w:type="dxa"/>
+              <w:right w:w="-1" w:type="dxa"/>
+            </w:tcMar>
+            <w:vAlign w:val="center"/>
+          </w:tcPr>
+          <w:p>
+            <w:pPr>
+              <w:spacing w:before="0" w:after="0" w:line="240" w:lineRule="auto"/>
+              <w:jc w:val="center"/>
+            </w:pPr>
+            <w:r>
+              <w:rPr>
+                <w:rFonts w:ascii="宋体" w:hAnsi="宋体" w:eastAsia="宋体"/>
+                <w:b w:val="0"/>
+                <w:sz w:val="20"/>
+              </w:rPr>
+              <w:t>SAP成本财务、MES生产能耗、WMS/TMS仓储运输、销售订单</w:t>
+            </w:r>
+          </w:p>
+        </w:tc>
+        <w:tc>
+          <w:tcPr>
+            <w:tcW w:w="1423" w:type="dxa"/>
+            <w:tcBorders>
+              <w:top w:val="nil"/>
+              <w:left w:val="nil"/>
+              <w:bottom w:val="nil"/>
+              <w:right w:val="nil"/>
+            </w:tcBorders>
+            <w:noWrap w:val="0"/>
+            <w:tcMar>
+              <w:top w:w="-1" w:type="dxa"/>
+              <w:left w:w="-1" w:type="dxa"/>
+              <w:bottom w:w="-1" w:type="dxa"/>
+              <w:right w:w="-1" w:type="dxa"/>
+            </w:tcMar>
+            <w:vAlign w:val="center"/>
+          </w:tcPr>
+          <w:p>
+            <w:pPr>
+              <w:spacing w:before="0" w:after="0" w:line="240" w:lineRule="auto"/>
+              <w:jc w:val="center"/>
+            </w:pPr>
+            <w:r>
+              <w:rPr>
+                <w:rFonts w:ascii="宋体" w:hAnsi="宋体" w:eastAsia="宋体"/>
+                <w:b w:val="0"/>
+                <w:sz w:val="20"/>
+              </w:rPr>
+              <w:t>多维成本、盈利及差异分析</w:t>
+            </w:r>
+          </w:p>
+        </w:tc>
+        <w:tc>
+          <w:tcPr>
+            <w:tcW w:w="757" w:type="dxa"/>
+            <w:tcBorders>
+              <w:top w:val="nil"/>
+              <w:left w:val="nil"/>
+              <w:bottom w:val="nil"/>
+              <w:right w:val="nil"/>
+            </w:tcBorders>
+            <w:noWrap w:val="0"/>
+            <w:tcMar>
+              <w:top w:w="-1" w:type="dxa"/>
+              <w:left w:w="-1" w:type="dxa"/>
+              <w:bottom w:w="-1" w:type="dxa"/>
+              <w:right w:w="-1" w:type="dxa"/>
+            </w:tcMar>
+            <w:vAlign w:val="center"/>
+          </w:tcPr>
+          <w:p>
+            <w:pPr>
+              <w:spacing w:before="0" w:after="0" w:line="240" w:lineRule="auto"/>
+              <w:jc w:val="center"/>
+            </w:pPr>
+            <w:r>
+              <w:rPr>
+                <w:rFonts w:ascii="宋体" w:hAnsi="宋体" w:eastAsia="宋体"/>
+                <w:b w:val="0"/>
+                <w:sz w:val="20"/>
+              </w:rPr>
+              <w:t>是</w:t>
+            </w:r>
+          </w:p>
+        </w:tc>
+      </w:tr>
+      <w:tr>
+        <w:tblPrEx>
+          <w:tblBorders>
+            <w:top w:val="none" w:color="auto" w:sz="4" w:space="0"/>
+            <w:left w:val="none" w:color="auto" w:sz="4" w:space="0"/>
+            <w:bottom w:val="none" w:color="auto" w:sz="4" w:space="0"/>
+            <w:right w:val="none" w:color="auto" w:sz="4" w:space="0"/>
+            <w:insideH w:val="none" w:color="auto" w:sz="4" w:space="0"/>
+            <w:insideV w:val="none" w:color="auto" w:sz="4" w:space="0"/>
+          </w:tblBorders>
+          <w:tblCellMar>
+            <w:top w:w="0" w:type="dxa"/>
+            <w:left w:w="108" w:type="dxa"/>
+            <w:bottom w:w="0" w:type="dxa"/>
+            <w:right w:w="108" w:type="dxa"/>
+          </w:tblCellMar>
+        </w:tblPrEx>
+        <w:trPr>
+          <w:trHeight w:val="787" w:hRule="atLeast"/>
+          <w:jc w:val="center"/>
+          <w:cantSplit/>
+        </w:trPr>
+        <w:tc>
+          <w:tcPr>
+            <w:tcW w:w="2479" w:type="dxa"/>
+            <w:tcBorders>
+              <w:top w:val="nil"/>
+              <w:left w:val="nil"/>
+              <w:bottom w:val="nil"/>
+              <w:right w:val="nil"/>
+            </w:tcBorders>
+            <w:noWrap w:val="0"/>
+            <w:tcMar>
+              <w:top w:w="-1" w:type="dxa"/>
+              <w:left w:w="-1" w:type="dxa"/>
+              <w:bottom w:w="-1" w:type="dxa"/>
+              <w:right w:w="-1" w:type="dxa"/>
+            </w:tcMar>
+            <w:vAlign w:val="center"/>
+          </w:tcPr>
+          <w:p>
+            <w:pPr>
+              <w:spacing w:before="0" w:after="0" w:line="240" w:lineRule="auto"/>
+              <w:jc w:val="center"/>
+            </w:pPr>
+            <w:r>
+              <w:rPr>
+                <w:rFonts w:ascii="宋体" w:hAnsi="宋体" w:eastAsia="宋体"/>
+                <w:b w:val="0"/>
+                <w:sz w:val="20"/>
+              </w:rPr>
+              <w:t>F-ZLTC-SCOS-AIZNT-008</w:t>
+            </w:r>
+          </w:p>
+        </w:tc>
+        <w:tc>
+          <w:tcPr>
+            <w:tcW w:w="1629" w:type="dxa"/>
+            <w:tcBorders>
+              <w:top w:val="nil"/>
+              <w:left w:val="nil"/>
+              <w:bottom w:val="nil"/>
+              <w:right w:val="nil"/>
+            </w:tcBorders>
+            <w:noWrap w:val="0"/>
+            <w:tcMar>
+              <w:top w:w="-1" w:type="dxa"/>
+              <w:left w:w="-1" w:type="dxa"/>
+              <w:bottom w:w="-1" w:type="dxa"/>
+              <w:right w:w="-1" w:type="dxa"/>
+            </w:tcMar>
+            <w:vAlign w:val="center"/>
+          </w:tcPr>
+          <w:p>
+            <w:pPr>
+              <w:spacing w:before="0" w:after="0" w:line="240" w:lineRule="auto"/>
+              <w:jc w:val="center"/>
+            </w:pPr>
+            <w:r>
+              <w:rPr>
+                <w:rFonts w:ascii="宋体" w:hAnsi="宋体" w:eastAsia="宋体"/>
+                <w:b w:val="0"/>
+                <w:sz w:val="20"/>
+              </w:rPr>
               <w:t>供应链全程追溯与质量协同</w:t>
             </w:r>
           </w:p>
@@ -1983,7 +2198,6 @@
               <w:spacing w:before="0" w:after="0" w:line="240" w:lineRule="auto"/>
               <w:jc w:val="center"/>
             </w:pPr>
-            <w:r/>
             <w:r>
               <w:rPr>
                 <w:rFonts w:ascii="宋体" w:hAnsi="宋体" w:eastAsia="宋体"/>
@@ -2017,7 +2231,6 @@
               <w:spacing w:before="0" w:after="0" w:line="240" w:lineRule="auto"/>
               <w:jc w:val="center"/>
             </w:pPr>
-            <w:r/>
             <w:r>
               <w:rPr>
                 <w:rFonts w:ascii="宋体" w:hAnsi="宋体" w:eastAsia="宋体"/>
@@ -2051,7 +2264,6 @@
               <w:spacing w:before="0" w:after="0" w:line="240" w:lineRule="auto"/>
               <w:jc w:val="center"/>
             </w:pPr>
-            <w:r/>
             <w:r>
               <w:rPr>
                 <w:rFonts w:ascii="宋体" w:hAnsi="宋体" w:eastAsia="宋体"/>
@@ -2085,7 +2297,6 @@
               <w:spacing w:before="0" w:after="0" w:line="240" w:lineRule="auto"/>
               <w:jc w:val="center"/>
             </w:pPr>
-            <w:r/>
             <w:r>
               <w:rPr>
                 <w:rFonts w:ascii="宋体" w:hAnsi="宋体" w:eastAsia="宋体"/>
@@ -2119,7 +2330,6 @@
               <w:spacing w:before="0" w:after="0" w:line="240" w:lineRule="auto"/>
               <w:jc w:val="center"/>
             </w:pPr>
-            <w:r/>
             <w:r>
               <w:rPr>
                 <w:rFonts w:ascii="宋体" w:hAnsi="宋体" w:eastAsia="宋体"/>

</xml_diff>